<commit_message>
Regenerate Module 1 DOCX with fixed task content
Rebuilt from updated notebook (fixed Task 3 sentence, + symbol, str() reference).

Co-Authored-By: Claude Sonnet 4.6 <noreply@anthropic.com>
</commit_message>
<xml_diff>
--- a/1_Strings/1_strings_notebook.docx
+++ b/1_Strings/1_strings_notebook.docx
@@ -471,6 +471,11 @@
       </w:r>
     </w:p>
     <w:p>
+      <w:pPr>
+        <w:pStyle w:val="SourceCode"/>
+      </w:pPr>
+    </w:p>
+    <w:p>
       <w:r>
         <w:pict>
           <v:rect style="width:0;height:1.5pt" o:hralign="center" o:hrstd="t" o:hr="t"/>
@@ -1041,9 +1046,6 @@
         <w:br/>
       </w:r>
       <w:r>
-        <w:br/>
-      </w:r>
-      <w:r>
         <w:rPr>
           <w:rStyle w:val="BuiltInTok"/>
         </w:rPr>
@@ -1157,6 +1159,17 @@
       </w:pPr>
       <w:r>
         <w:t xml:space="preserve">Print this sentence exactly:</w:t>
+      </w:r>
+    </w:p>
+    <w:p>
+      <w:pPr>
+        <w:pStyle w:val="SourceCode"/>
+      </w:pPr>
+      <w:r>
+        <w:rPr>
+          <w:rStyle w:val="VerbatimChar"/>
+        </w:rPr>
+        <w:t xml:space="preserve">Surah Al-Fatiha has 7 verses and it is the opening of the Quran.</w:t>
       </w:r>
     </w:p>
     <w:p>
@@ -3763,7 +3776,33 @@
         <w:pStyle w:val="FirstParagraph"/>
       </w:pPr>
       <w:r>
-        <w:t xml:space="preserve">Use to build and print this sentence (join at least 3 parts):</w:t>
+        <w:t xml:space="preserve">Use</w:t>
+      </w:r>
+      <w:r>
+        <w:t xml:space="preserve"> </w:t>
+      </w:r>
+      <w:r>
+        <w:rPr>
+          <w:rStyle w:val="VerbatimChar"/>
+        </w:rPr>
+        <w:t xml:space="preserve">+</w:t>
+      </w:r>
+      <w:r>
+        <w:t xml:space="preserve"> </w:t>
+      </w:r>
+      <w:r>
+        <w:t xml:space="preserve">to build and print this sentence (join at least 3 parts):</w:t>
+      </w:r>
+    </w:p>
+    <w:p>
+      <w:pPr>
+        <w:pStyle w:val="SourceCode"/>
+      </w:pPr>
+      <w:r>
+        <w:rPr>
+          <w:rStyle w:val="VerbatimChar"/>
+        </w:rPr>
+        <w:t xml:space="preserve">The Quran has 114 Surahs and 30 Paras.</w:t>
       </w:r>
     </w:p>
     <w:p>
@@ -3792,7 +3831,33 @@
         <w:pStyle w:val="FirstParagraph"/>
       </w:pPr>
       <w:r>
-        <w:t xml:space="preserve">Print this sentence using for the number:</w:t>
+        <w:t xml:space="preserve">Print this sentence using</w:t>
+      </w:r>
+      <w:r>
+        <w:t xml:space="preserve"> </w:t>
+      </w:r>
+      <w:r>
+        <w:rPr>
+          <w:rStyle w:val="VerbatimChar"/>
+        </w:rPr>
+        <w:t xml:space="preserve">str()</w:t>
+      </w:r>
+      <w:r>
+        <w:t xml:space="preserve"> </w:t>
+      </w:r>
+      <w:r>
+        <w:t xml:space="preserve">for the number:</w:t>
+      </w:r>
+    </w:p>
+    <w:p>
+      <w:pPr>
+        <w:pStyle w:val="SourceCode"/>
+      </w:pPr>
+      <w:r>
+        <w:rPr>
+          <w:rStyle w:val="VerbatimChar"/>
+        </w:rPr>
+        <w:t xml:space="preserve">Pakistan was created in 1947.</w:t>
       </w:r>
     </w:p>
     <w:p>
@@ -8627,7 +8692,19 @@
         <w:t xml:space="preserve"> </w:t>
       </w:r>
       <w:r>
-        <w:t xml:space="preserve">The next example uses the same name twice (once to greet, once to count letters). To reuse an answer, we give it a name — a</w:t>
+        <w:t xml:space="preserve">The next example uses the same name twice</w:t>
+      </w:r>
+      <w:r>
+        <w:t xml:space="preserve"> </w:t>
+      </w:r>
+      <w:r>
+        <w:t xml:space="preserve">(once to greet, once to count letters). To reuse an answer, we give it</w:t>
+      </w:r>
+      <w:r>
+        <w:t xml:space="preserve"> </w:t>
+      </w:r>
+      <w:r>
+        <w:t xml:space="preserve">a name — a</w:t>
       </w:r>
       <w:r>
         <w:t xml:space="preserve"> </w:t>

</xml_diff>